<commit_message>
Added session notes & xpath
</commit_message>
<xml_diff>
--- a/AllSessionNotes/Session Notes - Equiniti - C#- Playwright-Oct 2025.docx
+++ b/AllSessionNotes/Session Notes - Equiniti - C#- Playwright-Oct 2025.docx
@@ -1592,9 +1592,31 @@
       <w:r>
         <w:rPr>
           <w:rFonts w:ascii="Arial Unicode MS" w:cs="Arial Unicode MS" w:eastAsia="Arial Unicode MS" w:hAnsi="Arial Unicode MS"/>
+          <w:color w:val="001d35"/>
+          <w:sz w:val="24"/>
+          <w:szCs w:val="24"/>
+          <w:highlight w:val="white"/>
+          <w:rtl w:val="0"/>
+        </w:rPr>
+        <w:t xml:space="preserve">Encapsulation in C# → </w:t>
+      </w:r>
+      <w:r>
+        <w:rPr>
+          <w:rFonts w:ascii="Arial Unicode MS" w:cs="Arial Unicode MS" w:eastAsia="Arial Unicode MS" w:hAnsi="Arial Unicode MS"/>
           <w:rtl w:val="0"/>
         </w:rPr>
         <w:t xml:space="preserve">Properties → get, set </w:t>
+      </w:r>
+    </w:p>
+    <w:p>
+      <w:pPr>
+        <w:ind w:left="720" w:firstLine="0"/>
+        <w:rPr/>
+      </w:pPr>
+      <w:r>
+        <w:rPr>
+          <w:rtl w:val="0"/>
+        </w:rPr>
       </w:r>
     </w:p>
     <w:p>
@@ -1686,7 +1708,235 @@
           <w:rFonts w:ascii="Arial Unicode MS" w:cs="Arial Unicode MS" w:eastAsia="Arial Unicode MS" w:hAnsi="Arial Unicode MS"/>
           <w:rtl w:val="0"/>
         </w:rPr>
-        <w:t xml:space="preserve">var → assigns the datatype during the compile time </w:t>
+        <w:t xml:space="preserve">var → assigns the datatype during compile time </w:t>
+      </w:r>
+    </w:p>
+    <w:p>
+      <w:pPr>
+        <w:numPr>
+          <w:ilvl w:val="0"/>
+          <w:numId w:val="2"/>
+        </w:numPr>
+        <w:ind w:left="720" w:hanging="360"/>
+        <w:rPr>
+          <w:u w:val="none"/>
+        </w:rPr>
+      </w:pPr>
+      <w:r>
+        <w:rPr>
+          <w:rtl w:val="0"/>
+        </w:rPr>
+        <w:t xml:space="preserve">Constructor - Pre-requisite for the object</w:t>
+      </w:r>
+    </w:p>
+    <w:p>
+      <w:pPr>
+        <w:numPr>
+          <w:ilvl w:val="1"/>
+          <w:numId w:val="2"/>
+        </w:numPr>
+        <w:ind w:left="1440" w:hanging="360"/>
+        <w:rPr>
+          <w:u w:val="none"/>
+        </w:rPr>
+      </w:pPr>
+      <w:r>
+        <w:rPr>
+          <w:rtl w:val="0"/>
+        </w:rPr>
+        <w:t xml:space="preserve">Constructor name and classname should be same. </w:t>
+      </w:r>
+    </w:p>
+    <w:p>
+      <w:pPr>
+        <w:numPr>
+          <w:ilvl w:val="1"/>
+          <w:numId w:val="2"/>
+        </w:numPr>
+        <w:ind w:left="1440" w:hanging="360"/>
+        <w:rPr>
+          <w:u w:val="none"/>
+        </w:rPr>
+      </w:pPr>
+      <w:r>
+        <w:rPr>
+          <w:rtl w:val="0"/>
+        </w:rPr>
+        <w:t xml:space="preserve">It is kind of method that gets called during the object creation. </w:t>
+      </w:r>
+    </w:p>
+    <w:p>
+      <w:pPr>
+        <w:numPr>
+          <w:ilvl w:val="1"/>
+          <w:numId w:val="2"/>
+        </w:numPr>
+        <w:ind w:left="1440" w:hanging="360"/>
+        <w:rPr>
+          <w:u w:val="none"/>
+        </w:rPr>
+      </w:pPr>
+      <w:r>
+        <w:rPr>
+          <w:rtl w:val="0"/>
+        </w:rPr>
+        <w:t xml:space="preserve">There will be always a default constructor. It helps to load all the non-static variables with default values in the current object </w:t>
+      </w:r>
+    </w:p>
+    <w:p>
+      <w:pPr>
+        <w:numPr>
+          <w:ilvl w:val="1"/>
+          <w:numId w:val="2"/>
+        </w:numPr>
+        <w:ind w:left="1440" w:hanging="360"/>
+        <w:rPr>
+          <w:u w:val="none"/>
+        </w:rPr>
+      </w:pPr>
+      <w:r>
+        <w:rPr>
+          <w:rtl w:val="0"/>
+        </w:rPr>
+        <w:t xml:space="preserve">We can override the default constructor by creating our own constructor </w:t>
+      </w:r>
+    </w:p>
+    <w:p>
+      <w:pPr>
+        <w:numPr>
+          <w:ilvl w:val="2"/>
+          <w:numId w:val="2"/>
+        </w:numPr>
+        <w:ind w:left="2160" w:hanging="360"/>
+        <w:rPr>
+          <w:u w:val="none"/>
+        </w:rPr>
+      </w:pPr>
+      <w:r>
+        <w:rPr>
+          <w:rtl w:val="0"/>
+        </w:rPr>
+        <w:t xml:space="preserve">Without arguments </w:t>
+      </w:r>
+    </w:p>
+    <w:p>
+      <w:pPr>
+        <w:numPr>
+          <w:ilvl w:val="2"/>
+          <w:numId w:val="2"/>
+        </w:numPr>
+        <w:ind w:left="2160" w:hanging="360"/>
+        <w:rPr>
+          <w:u w:val="none"/>
+        </w:rPr>
+      </w:pPr>
+      <w:r>
+        <w:rPr>
+          <w:rtl w:val="0"/>
+        </w:rPr>
+        <w:t xml:space="preserve">With arguments </w:t>
+      </w:r>
+    </w:p>
+    <w:p>
+      <w:pPr>
+        <w:numPr>
+          <w:ilvl w:val="1"/>
+          <w:numId w:val="2"/>
+        </w:numPr>
+        <w:ind w:left="1440" w:hanging="360"/>
+        <w:rPr>
+          <w:highlight w:val="green"/>
+        </w:rPr>
+      </w:pPr>
+      <w:r>
+        <w:rPr>
+          <w:highlight w:val="green"/>
+          <w:rtl w:val="0"/>
+        </w:rPr>
+        <w:t xml:space="preserve">When there is a constructor explicitly created, then on object creation we need to call it. </w:t>
+      </w:r>
+    </w:p>
+    <w:p>
+      <w:pPr>
+        <w:ind w:left="2160" w:firstLine="0"/>
+        <w:rPr>
+          <w:highlight w:val="yellow"/>
+        </w:rPr>
+      </w:pPr>
+      <w:r>
+        <w:rPr>
+          <w:rtl w:val="0"/>
+        </w:rPr>
+      </w:r>
+    </w:p>
+    <w:p>
+      <w:pPr>
+        <w:numPr>
+          <w:ilvl w:val="0"/>
+          <w:numId w:val="2"/>
+        </w:numPr>
+        <w:ind w:left="720" w:hanging="360"/>
+        <w:rPr>
+          <w:highlight w:val="yellow"/>
+        </w:rPr>
+      </w:pPr>
+      <w:r>
+        <w:rPr>
+          <w:highlight w:val="yellow"/>
+          <w:rtl w:val="0"/>
+        </w:rPr>
+        <w:t xml:space="preserve">Constructor Overloading </w:t>
+      </w:r>
+    </w:p>
+    <w:p>
+      <w:pPr>
+        <w:numPr>
+          <w:ilvl w:val="0"/>
+          <w:numId w:val="2"/>
+        </w:numPr>
+        <w:ind w:left="720" w:hanging="360"/>
+        <w:rPr>
+          <w:highlight w:val="yellow"/>
+        </w:rPr>
+      </w:pPr>
+      <w:r>
+        <w:rPr>
+          <w:highlight w:val="yellow"/>
+          <w:rtl w:val="0"/>
+        </w:rPr>
+        <w:t xml:space="preserve">Method Overloading </w:t>
+      </w:r>
+    </w:p>
+    <w:p>
+      <w:pPr>
+        <w:rPr>
+          <w:highlight w:val="yellow"/>
+        </w:rPr>
+      </w:pPr>
+      <w:r>
+        <w:rPr>
+          <w:rtl w:val="0"/>
+        </w:rPr>
+      </w:r>
+    </w:p>
+    <w:p>
+      <w:pPr>
+        <w:rPr/>
+      </w:pPr>
+      <w:r>
+        <w:rPr>
+          <w:rtl w:val="0"/>
+        </w:rPr>
+      </w:r>
+    </w:p>
+    <w:p>
+      <w:pPr>
+        <w:rPr/>
+      </w:pPr>
+      <w:r>
+        <w:rPr>
+          <w:rtl w:val="0"/>
+        </w:rPr>
       </w:r>
     </w:p>
     <w:p>
@@ -2094,6 +2344,17 @@
     </w:p>
     <w:p>
       <w:pPr>
+        <w:ind w:left="720" w:firstLine="0"/>
+        <w:rPr/>
+      </w:pPr>
+      <w:r>
+        <w:rPr>
+          <w:rtl w:val="0"/>
+        </w:rPr>
+      </w:r>
+    </w:p>
+    <w:p>
+      <w:pPr>
         <w:numPr>
           <w:ilvl w:val="0"/>
           <w:numId w:val="4"/>
@@ -2164,16 +2425,14 @@
           <w:numId w:val="4"/>
         </w:numPr>
         <w:ind w:left="720" w:hanging="360"/>
-        <w:rPr>
-          <w:highlight w:val="yellow"/>
-        </w:rPr>
-      </w:pPr>
-      <w:r>
-        <w:rPr>
-          <w:highlight w:val="yellow"/>
-          <w:rtl w:val="0"/>
-        </w:rPr>
-        <w:t xml:space="preserve">Alert </w:t>
+        <w:rPr/>
+      </w:pPr>
+      <w:r>
+        <w:rPr>
+          <w:rFonts w:ascii="Arial Unicode MS" w:cs="Arial Unicode MS" w:eastAsia="Arial Unicode MS" w:hAnsi="Arial Unicode MS"/>
+          <w:rtl w:val="0"/>
+        </w:rPr>
+        <w:t xml:space="preserve">To inspect → f12 or ctrl+shift+c </w:t>
       </w:r>
     </w:p>
     <w:p>
@@ -2183,16 +2442,116 @@
           <w:numId w:val="4"/>
         </w:numPr>
         <w:ind w:left="720" w:hanging="360"/>
-        <w:rPr>
-          <w:highlight w:val="yellow"/>
-        </w:rPr>
-      </w:pPr>
-      <w:r>
-        <w:rPr>
-          <w:highlight w:val="yellow"/>
-          <w:rtl w:val="0"/>
-        </w:rPr>
-        <w:t xml:space="preserve">RunWith, event (alert) </w:t>
+        <w:rPr/>
+      </w:pPr>
+      <w:r>
+        <w:rPr>
+          <w:rtl w:val="0"/>
+        </w:rPr>
+        <w:t xml:space="preserve">Alert </w:t>
+      </w:r>
+    </w:p>
+    <w:p>
+      <w:pPr>
+        <w:numPr>
+          <w:ilvl w:val="1"/>
+          <w:numId w:val="4"/>
+        </w:numPr>
+        <w:ind w:left="1440" w:hanging="360"/>
+        <w:rPr>
+          <w:u w:val="none"/>
+        </w:rPr>
+      </w:pPr>
+      <w:r>
+        <w:rPr>
+          <w:rtl w:val="0"/>
+        </w:rPr>
+        <w:t xml:space="preserve">JavaScript alert - Playwright handles it automatically </w:t>
+      </w:r>
+    </w:p>
+    <w:p>
+      <w:pPr>
+        <w:rPr/>
+      </w:pPr>
+      <w:r>
+        <w:rPr>
+          <w:rtl w:val="0"/>
+        </w:rPr>
+      </w:r>
+    </w:p>
+    <w:p>
+      <w:pPr>
+        <w:numPr>
+          <w:ilvl w:val="0"/>
+          <w:numId w:val="4"/>
+        </w:numPr>
+        <w:ind w:left="720" w:hanging="360"/>
+        <w:rPr/>
+      </w:pPr>
+      <w:r>
+        <w:rPr>
+          <w:rtl w:val="0"/>
+        </w:rPr>
+        <w:t xml:space="preserve">Upload </w:t>
+      </w:r>
+    </w:p>
+    <w:p>
+      <w:pPr>
+        <w:numPr>
+          <w:ilvl w:val="1"/>
+          <w:numId w:val="4"/>
+        </w:numPr>
+        <w:ind w:left="1440" w:hanging="360"/>
+        <w:rPr/>
+      </w:pPr>
+      <w:r>
+        <w:rPr>
+          <w:rtl w:val="0"/>
+        </w:rPr>
+        <w:t xml:space="preserve">Direct method  - for upload check for xpath - //input[@type='file']</w:t>
+      </w:r>
+    </w:p>
+    <w:p>
+      <w:pPr>
+        <w:numPr>
+          <w:ilvl w:val="1"/>
+          <w:numId w:val="4"/>
+        </w:numPr>
+        <w:ind w:left="1440" w:hanging="360"/>
+        <w:rPr/>
+      </w:pPr>
+      <w:r>
+        <w:rPr>
+          <w:rtl w:val="0"/>
+        </w:rPr>
+        <w:t xml:space="preserve">Event handler </w:t>
+      </w:r>
+    </w:p>
+    <w:p>
+      <w:pPr>
+        <w:numPr>
+          <w:ilvl w:val="1"/>
+          <w:numId w:val="4"/>
+        </w:numPr>
+        <w:ind w:left="1440" w:hanging="360"/>
+        <w:rPr/>
+      </w:pPr>
+      <w:r>
+        <w:rPr>
+          <w:rtl w:val="0"/>
+        </w:rPr>
+        <w:t xml:space="preserve">RunAndWait methods </w:t>
+      </w:r>
+    </w:p>
+    <w:p>
+      <w:pPr>
+        <w:ind w:left="1440" w:firstLine="0"/>
+        <w:rPr/>
+      </w:pPr>
+      <w:r>
+        <w:rPr>
+          <w:rtl w:val="0"/>
+        </w:rPr>
       </w:r>
     </w:p>
     <w:p>
@@ -2593,6 +2952,36 @@
     </w:p>
     <w:p>
       <w:pPr>
+        <w:rPr/>
+      </w:pPr>
+      <w:r>
+        <w:rPr>
+          <w:rtl w:val="0"/>
+        </w:rPr>
+      </w:r>
+    </w:p>
+    <w:p>
+      <w:pPr>
+        <w:rPr/>
+      </w:pPr>
+      <w:r>
+        <w:rPr>
+          <w:rtl w:val="0"/>
+        </w:rPr>
+      </w:r>
+    </w:p>
+    <w:p>
+      <w:pPr>
+        <w:rPr/>
+      </w:pPr>
+      <w:r>
+        <w:rPr>
+          <w:rtl w:val="0"/>
+        </w:rPr>
+      </w:r>
+    </w:p>
+    <w:p>
+      <w:pPr>
         <w:numPr>
           <w:ilvl w:val="0"/>
           <w:numId w:val="6"/>
@@ -3059,34 +3448,23 @@
         <w:keepNext w:val="0"/>
         <w:keepLines w:val="0"/>
         <w:spacing w:before="480" w:lineRule="auto"/>
+        <w:rPr/>
+      </w:pPr>
+      <w:bookmarkStart w:colFirst="0" w:colLast="0" w:name="_n6auc22r4npz" w:id="0"/>
+      <w:bookmarkEnd w:id="0"/>
+      <w:r>
         <w:rPr>
           <w:b w:val="1"/>
           <w:sz w:val="46"/>
           <w:szCs w:val="46"/>
-        </w:rPr>
-      </w:pPr>
-      <w:bookmarkStart w:colFirst="0" w:colLast="0" w:name="_n6auc22r4npz" w:id="0"/>
-      <w:bookmarkEnd w:id="0"/>
-      <w:r>
-        <w:rPr>
-          <w:b w:val="1"/>
-          <w:sz w:val="46"/>
-          <w:szCs w:val="46"/>
           <w:rtl w:val="0"/>
         </w:rPr>
         <w:t xml:space="preserve">Assignments:</w:t>
       </w:r>
-    </w:p>
-    <w:p>
-      <w:pPr>
-        <w:spacing w:after="240" w:before="240" w:lineRule="auto"/>
-        <w:rPr/>
-      </w:pPr>
-      <w:r>
-        <w:rPr>
-          <w:rtl w:val="0"/>
-        </w:rPr>
-        <w:t xml:space="preserve"> </w:t>
+      <w:r>
+        <w:rPr>
+          <w:rtl w:val="0"/>
+        </w:rPr>
       </w:r>
     </w:p>
     <w:p>
@@ -3846,7 +4224,7 @@
         <w:rPr>
           <w:rtl w:val="0"/>
         </w:rPr>
-        <w:t xml:space="preserve"> Navigate onto https://nasscom.in/</w:t>
+        <w:t xml:space="preserve"> Navigate to https://nasscom.in/</w:t>
       </w:r>
     </w:p>
     <w:p>
@@ -4071,30 +4449,6 @@
           <w:rtl w:val="0"/>
         </w:rPr>
         <w:t xml:space="preserve">Click on Register</w:t>
-      </w:r>
-    </w:p>
-    <w:p>
-      <w:pPr>
-        <w:spacing w:after="240" w:before="240" w:lineRule="auto"/>
-        <w:rPr/>
-      </w:pPr>
-      <w:r>
-        <w:rPr>
-          <w:rtl w:val="0"/>
-        </w:rPr>
-        <w:t xml:space="preserve"> </w:t>
-      </w:r>
-    </w:p>
-    <w:p>
-      <w:pPr>
-        <w:spacing w:after="240" w:before="240" w:lineRule="auto"/>
-        <w:rPr/>
-      </w:pPr>
-      <w:r>
-        <w:rPr>
-          <w:rtl w:val="0"/>
-        </w:rPr>
-        <w:t xml:space="preserve"> </w:t>
       </w:r>
     </w:p>
     <w:p>
@@ -4103,36 +4457,24 @@
         <w:keepNext w:val="0"/>
         <w:keepLines w:val="0"/>
         <w:spacing w:before="280" w:lineRule="auto"/>
+        <w:rPr/>
+      </w:pPr>
+      <w:bookmarkStart w:colFirst="0" w:colLast="0" w:name="_yhe9j4kos5zg" w:id="4"/>
+      <w:bookmarkEnd w:id="4"/>
+      <w:r>
         <w:rPr>
           <w:b w:val="1"/>
           <w:color w:val="000000"/>
           <w:sz w:val="26"/>
           <w:szCs w:val="26"/>
-        </w:rPr>
-      </w:pPr>
-      <w:bookmarkStart w:colFirst="0" w:colLast="0" w:name="_yhe9j4kos5zg" w:id="4"/>
-      <w:bookmarkEnd w:id="4"/>
-      <w:r>
-        <w:rPr>
-          <w:b w:val="1"/>
-          <w:color w:val="000000"/>
-          <w:sz w:val="26"/>
-          <w:szCs w:val="26"/>
           <w:rtl w:val="0"/>
         </w:rPr>
         <w:t xml:space="preserve">Multiple tabs</w:t>
       </w:r>
-    </w:p>
-    <w:p>
-      <w:pPr>
-        <w:spacing w:after="240" w:before="240" w:line="252.00000000000003" w:lineRule="auto"/>
-        <w:rPr/>
-      </w:pPr>
-      <w:r>
-        <w:rPr>
-          <w:rtl w:val="0"/>
-        </w:rPr>
-        <w:t xml:space="preserve"> </w:t>
+      <w:r>
+        <w:rPr>
+          <w:rtl w:val="0"/>
+        </w:rPr>
       </w:r>
     </w:p>
     <w:p>
@@ -4696,7 +5038,7 @@
 
 <file path=word/comments.xml><?xml version="1.0" encoding="utf-8"?>
 <w:comments xmlns:mc="http://schemas.openxmlformats.org/markup-compatibility/2006" xmlns:o="urn:schemas-microsoft-com:office:office" xmlns:r="http://schemas.openxmlformats.org/officeDocument/2006/relationships" xmlns:m="http://schemas.openxmlformats.org/officeDocument/2006/math" xmlns:v="urn:schemas-microsoft-com:vml" xmlns:wp="http://schemas.openxmlformats.org/drawingml/2006/wordprocessingDrawing" xmlns:w10="urn:schemas-microsoft-com:office:word" xmlns:w="http://schemas.openxmlformats.org/wordprocessingml/2006/main" xmlns:wne="http://schemas.microsoft.com/office/word/2006/wordml" xmlns:sl="http://schemas.openxmlformats.org/schemaLibrary/2006/main" xmlns:a="http://schemas.openxmlformats.org/drawingml/2006/main" xmlns:pic="http://schemas.openxmlformats.org/drawingml/2006/picture" xmlns:c="http://schemas.openxmlformats.org/drawingml/2006/chart" xmlns:lc="http://schemas.openxmlformats.org/drawingml/2006/lockedCanvas" xmlns:dgm="http://schemas.openxmlformats.org/drawingml/2006/diagram" xmlns:wps="http://schemas.microsoft.com/office/word/2010/wordprocessingShape" xmlns:wpg="http://schemas.microsoft.com/office/word/2010/wordprocessingGroup" xmlns:w14="http://schemas.microsoft.com/office/word/2010/wordml" xmlns:w15="http://schemas.microsoft.com/office/word/2012/wordml" xmlns:w16="http://schemas.microsoft.com/office/word/2018/wordml" xmlns:w16cex="http://schemas.microsoft.com/office/word/2018/wordml/cex" xmlns:w16cid="http://schemas.microsoft.com/office/word/2016/wordml/cid" xmlns="http://schemas.microsoft.com/office/tasks/2019/documenttasks" xmlns:cr="http://schemas.microsoft.com/office/comments/2020/reactions">
-  <w:comment w:author="Balaji D" w:id="7" w:date="2025-10-10T13:37:17Z">
+  <w:comment w:author="Balaji D" w:id="1" w:date="2025-10-06T10:21:20Z">
     <w:p>
       <w:pPr>
         <w:keepNext w:val="0"/>
@@ -4743,11 +5085,11 @@
           <w:vertAlign w:val="baseline"/>
           <w:rtl w:val="0"/>
         </w:rPr>
-        <w:t xml:space="preserve">git push</w:t>
+        <w:t xml:space="preserve">with the help of CLI</w:t>
       </w:r>
     </w:p>
   </w:comment>
-  <w:comment w:author="Balaji D" w:id="1" w:date="2025-10-06T10:21:20Z">
+  <w:comment w:author="Balaji D" w:id="3" w:date="2025-10-06T10:21:20Z">
     <w:p>
       <w:pPr>
         <w:keepNext w:val="0"/>
@@ -4798,7 +5140,7 @@
       </w:r>
     </w:p>
   </w:comment>
-  <w:comment w:author="Balaji D" w:id="3" w:date="2025-10-06T10:21:20Z">
+  <w:comment w:author="Balaji D" w:id="5" w:date="2025-10-06T10:21:20Z">
     <w:p>
       <w:pPr>
         <w:keepNext w:val="0"/>
@@ -4849,7 +5191,7 @@
       </w:r>
     </w:p>
   </w:comment>
-  <w:comment w:author="Balaji D" w:id="5" w:date="2025-10-06T10:21:20Z">
+  <w:comment w:author="Balaji D" w:id="7" w:date="2025-10-10T13:37:17Z">
     <w:p>
       <w:pPr>
         <w:keepNext w:val="0"/>
@@ -4896,7 +5238,7 @@
           <w:vertAlign w:val="baseline"/>
           <w:rtl w:val="0"/>
         </w:rPr>
-        <w:t xml:space="preserve">with the help of CLI</w:t>
+        <w:t xml:space="preserve">git push</w:t>
       </w:r>
     </w:p>
   </w:comment>

</xml_diff>